<commit_message>
Profit and loss problems
</commit_message>
<xml_diff>
--- a/Quant_Aptitude/Profit&Loss/Profit&Loss.docx
+++ b/Quant_Aptitude/Profit&Loss/Profit&Loss.docx
@@ -433,8 +433,6 @@
       <w:pPr>
         <w:pStyle w:val="ListParagraph"/>
       </w:pPr>
-      <w:bookmarkStart w:id="0" w:name="_GoBack"/>
-      <w:bookmarkEnd w:id="0"/>
     </w:p>
     <w:p>
       <w:pPr>
@@ -498,6 +496,337 @@
           <w:shd w:val="clear" w:color="auto" w:fill="FFFFFF"/>
         </w:rPr>
         <w:t>. 6. Gain percent is:</w:t>
+      </w:r>
+    </w:p>
+    <w:p>
+      <w:pPr>
+        <w:pStyle w:val="ListParagraph"/>
+      </w:pPr>
+    </w:p>
+    <w:p>
+      <w:pPr>
+        <w:pStyle w:val="ListParagraph"/>
+        <w:numPr>
+          <w:ilvl w:val="0"/>
+          <w:numId w:val="1"/>
+        </w:numPr>
+      </w:pPr>
+      <w:r>
+        <w:rPr>
+          <w:rFonts w:ascii="Arial" w:hAnsi="Arial" w:cs="Arial"/>
+          <w:shd w:val="clear" w:color="auto" w:fill="FFFFFF"/>
+        </w:rPr>
+        <w:t xml:space="preserve">On selling 17 balls at </w:t>
+      </w:r>
+      <w:proofErr w:type="spellStart"/>
+      <w:r>
+        <w:rPr>
+          <w:rFonts w:ascii="Arial" w:hAnsi="Arial" w:cs="Arial"/>
+          <w:shd w:val="clear" w:color="auto" w:fill="FFFFFF"/>
+        </w:rPr>
+        <w:t>Rs</w:t>
+      </w:r>
+      <w:proofErr w:type="spellEnd"/>
+      <w:r>
+        <w:rPr>
+          <w:rFonts w:ascii="Arial" w:hAnsi="Arial" w:cs="Arial"/>
+          <w:shd w:val="clear" w:color="auto" w:fill="FFFFFF"/>
+        </w:rPr>
+        <w:t>. 720, there is a loss equal to the cost </w:t>
+      </w:r>
+      <w:hyperlink r:id="rId5" w:history="1">
+        <w:r>
+          <w:rPr>
+            <w:rStyle w:val="Hyperlink"/>
+          </w:rPr>
+          <w:t> </w:t>
+        </w:r>
+        <w:r>
+          <w:rPr>
+            <w:rStyle w:val="google-anno-t"/>
+            <w:color w:val="0000FF"/>
+            <w:u w:val="single"/>
+          </w:rPr>
+          <w:t>price</w:t>
+        </w:r>
+      </w:hyperlink>
+      <w:r>
+        <w:rPr>
+          <w:rFonts w:ascii="Arial" w:hAnsi="Arial" w:cs="Arial"/>
+          <w:shd w:val="clear" w:color="auto" w:fill="FFFFFF"/>
+        </w:rPr>
+        <w:t xml:space="preserve"> of </w:t>
+      </w:r>
+      <w:proofErr w:type="gramStart"/>
+      <w:r>
+        <w:rPr>
+          <w:rFonts w:ascii="Arial" w:hAnsi="Arial" w:cs="Arial"/>
+          <w:shd w:val="clear" w:color="auto" w:fill="FFFFFF"/>
+        </w:rPr>
+        <w:t>5</w:t>
+      </w:r>
+      <w:proofErr w:type="gramEnd"/>
+      <w:r>
+        <w:rPr>
+          <w:rFonts w:ascii="Arial" w:hAnsi="Arial" w:cs="Arial"/>
+          <w:shd w:val="clear" w:color="auto" w:fill="FFFFFF"/>
+        </w:rPr>
+        <w:t xml:space="preserve"> balls. The cost price of a ball is</w:t>
+      </w:r>
+    </w:p>
+    <w:p>
+      <w:pPr>
+        <w:pStyle w:val="ListParagraph"/>
+      </w:pPr>
+    </w:p>
+    <w:p>
+      <w:pPr>
+        <w:pStyle w:val="ListParagraph"/>
+        <w:numPr>
+          <w:ilvl w:val="0"/>
+          <w:numId w:val="1"/>
+        </w:numPr>
+      </w:pPr>
+      <w:r>
+        <w:rPr>
+          <w:rFonts w:ascii="Arial" w:hAnsi="Arial" w:cs="Arial"/>
+          <w:shd w:val="clear" w:color="auto" w:fill="FFFFFF"/>
+        </w:rPr>
+        <w:t xml:space="preserve">When a plot </w:t>
+      </w:r>
+      <w:proofErr w:type="gramStart"/>
+      <w:r>
+        <w:rPr>
+          <w:rFonts w:ascii="Arial" w:hAnsi="Arial" w:cs="Arial"/>
+          <w:shd w:val="clear" w:color="auto" w:fill="FFFFFF"/>
+        </w:rPr>
+        <w:t>is sold</w:t>
+      </w:r>
+      <w:proofErr w:type="gramEnd"/>
+      <w:r>
+        <w:rPr>
+          <w:rFonts w:ascii="Arial" w:hAnsi="Arial" w:cs="Arial"/>
+          <w:shd w:val="clear" w:color="auto" w:fill="FFFFFF"/>
+        </w:rPr>
+        <w:t xml:space="preserve"> for </w:t>
+      </w:r>
+      <w:proofErr w:type="spellStart"/>
+      <w:r>
+        <w:rPr>
+          <w:rFonts w:ascii="Arial" w:hAnsi="Arial" w:cs="Arial"/>
+          <w:shd w:val="clear" w:color="auto" w:fill="FFFFFF"/>
+        </w:rPr>
+        <w:t>Rs</w:t>
+      </w:r>
+      <w:proofErr w:type="spellEnd"/>
+      <w:r>
+        <w:rPr>
+          <w:rFonts w:ascii="Arial" w:hAnsi="Arial" w:cs="Arial"/>
+          <w:shd w:val="clear" w:color="auto" w:fill="FFFFFF"/>
+        </w:rPr>
+        <w:t xml:space="preserve">. 18,700, the owner loses 15%. At what price </w:t>
+      </w:r>
+      <w:proofErr w:type="gramStart"/>
+      <w:r>
+        <w:rPr>
+          <w:rFonts w:ascii="Arial" w:hAnsi="Arial" w:cs="Arial"/>
+          <w:shd w:val="clear" w:color="auto" w:fill="FFFFFF"/>
+        </w:rPr>
+        <w:t>must that plot be sold</w:t>
+      </w:r>
+      <w:proofErr w:type="gramEnd"/>
+      <w:r>
+        <w:rPr>
+          <w:rFonts w:ascii="Arial" w:hAnsi="Arial" w:cs="Arial"/>
+          <w:shd w:val="clear" w:color="auto" w:fill="FFFFFF"/>
+        </w:rPr>
+        <w:t xml:space="preserve"> in order to gain 15%?</w:t>
+      </w:r>
+    </w:p>
+    <w:p>
+      <w:pPr>
+        <w:pStyle w:val="ListParagraph"/>
+      </w:pPr>
+    </w:p>
+    <w:p>
+      <w:pPr>
+        <w:pStyle w:val="ListParagraph"/>
+        <w:numPr>
+          <w:ilvl w:val="0"/>
+          <w:numId w:val="1"/>
+        </w:numPr>
+      </w:pPr>
+      <w:proofErr w:type="gramStart"/>
+      <w:r>
+        <w:rPr>
+          <w:rFonts w:ascii="Arial" w:hAnsi="Arial" w:cs="Arial"/>
+          <w:shd w:val="clear" w:color="auto" w:fill="FFFFFF"/>
+        </w:rPr>
+        <w:t>100</w:t>
+      </w:r>
+      <w:proofErr w:type="gramEnd"/>
+      <w:r>
+        <w:rPr>
+          <w:rFonts w:ascii="Arial" w:hAnsi="Arial" w:cs="Arial"/>
+          <w:shd w:val="clear" w:color="auto" w:fill="FFFFFF"/>
+        </w:rPr>
+        <w:t xml:space="preserve"> oranges are bought at the rate of </w:t>
+      </w:r>
+      <w:proofErr w:type="spellStart"/>
+      <w:r>
+        <w:rPr>
+          <w:rFonts w:ascii="Arial" w:hAnsi="Arial" w:cs="Arial"/>
+          <w:shd w:val="clear" w:color="auto" w:fill="FFFFFF"/>
+        </w:rPr>
+        <w:t>Rs</w:t>
+      </w:r>
+      <w:proofErr w:type="spellEnd"/>
+      <w:r>
+        <w:rPr>
+          <w:rFonts w:ascii="Arial" w:hAnsi="Arial" w:cs="Arial"/>
+          <w:shd w:val="clear" w:color="auto" w:fill="FFFFFF"/>
+        </w:rPr>
+        <w:t xml:space="preserve">. 350 and sold at the rate of </w:t>
+      </w:r>
+      <w:proofErr w:type="spellStart"/>
+      <w:r>
+        <w:rPr>
+          <w:rFonts w:ascii="Arial" w:hAnsi="Arial" w:cs="Arial"/>
+          <w:shd w:val="clear" w:color="auto" w:fill="FFFFFF"/>
+        </w:rPr>
+        <w:t>Rs</w:t>
+      </w:r>
+      <w:proofErr w:type="spellEnd"/>
+      <w:r>
+        <w:rPr>
+          <w:rFonts w:ascii="Arial" w:hAnsi="Arial" w:cs="Arial"/>
+          <w:shd w:val="clear" w:color="auto" w:fill="FFFFFF"/>
+        </w:rPr>
+        <w:t>. 48 per dozen. The percentage of profit or loss is:</w:t>
+      </w:r>
+    </w:p>
+    <w:p>
+      <w:pPr>
+        <w:pStyle w:val="ListParagraph"/>
+      </w:pPr>
+    </w:p>
+    <w:p>
+      <w:pPr>
+        <w:pStyle w:val="ListParagraph"/>
+        <w:numPr>
+          <w:ilvl w:val="0"/>
+          <w:numId w:val="1"/>
+        </w:numPr>
+      </w:pPr>
+      <w:r>
+        <w:rPr>
+          <w:rFonts w:ascii="Arial" w:hAnsi="Arial" w:cs="Arial"/>
+          <w:shd w:val="clear" w:color="auto" w:fill="FFFFFF"/>
+        </w:rPr>
+        <w:t xml:space="preserve">A shopkeeper sells one transistor for </w:t>
+      </w:r>
+      <w:proofErr w:type="spellStart"/>
+      <w:r>
+        <w:rPr>
+          <w:rFonts w:ascii="Arial" w:hAnsi="Arial" w:cs="Arial"/>
+          <w:shd w:val="clear" w:color="auto" w:fill="FFFFFF"/>
+        </w:rPr>
+        <w:t>Rs</w:t>
+      </w:r>
+      <w:proofErr w:type="spellEnd"/>
+      <w:r>
+        <w:rPr>
+          <w:rFonts w:ascii="Arial" w:hAnsi="Arial" w:cs="Arial"/>
+          <w:shd w:val="clear" w:color="auto" w:fill="FFFFFF"/>
+        </w:rPr>
+        <w:t xml:space="preserve">. 840 at a gain of 20% and another for </w:t>
+      </w:r>
+      <w:proofErr w:type="spellStart"/>
+      <w:r>
+        <w:rPr>
+          <w:rFonts w:ascii="Arial" w:hAnsi="Arial" w:cs="Arial"/>
+          <w:shd w:val="clear" w:color="auto" w:fill="FFFFFF"/>
+        </w:rPr>
+        <w:t>Rs</w:t>
+      </w:r>
+      <w:proofErr w:type="spellEnd"/>
+      <w:r>
+        <w:rPr>
+          <w:rFonts w:ascii="Arial" w:hAnsi="Arial" w:cs="Arial"/>
+          <w:shd w:val="clear" w:color="auto" w:fill="FFFFFF"/>
+        </w:rPr>
+        <w:t>. 960 at a loss of 4%. His total gain or loss percent is:</w:t>
+      </w:r>
+    </w:p>
+    <w:p>
+      <w:pPr>
+        <w:pStyle w:val="ListParagraph"/>
+      </w:pPr>
+      <w:bookmarkStart w:id="0" w:name="_GoBack"/>
+      <w:bookmarkEnd w:id="0"/>
+    </w:p>
+    <w:p>
+      <w:pPr>
+        <w:pStyle w:val="ListParagraph"/>
+        <w:numPr>
+          <w:ilvl w:val="0"/>
+          <w:numId w:val="1"/>
+        </w:numPr>
+      </w:pPr>
+      <w:r>
+        <w:rPr>
+          <w:rFonts w:ascii="Arial" w:hAnsi="Arial" w:cs="Arial"/>
+          <w:shd w:val="clear" w:color="auto" w:fill="FFFFFF"/>
+        </w:rPr>
+        <w:t xml:space="preserve">A trader mixes 26 kg of rice at </w:t>
+      </w:r>
+      <w:proofErr w:type="spellStart"/>
+      <w:r>
+        <w:rPr>
+          <w:rFonts w:ascii="Arial" w:hAnsi="Arial" w:cs="Arial"/>
+          <w:shd w:val="clear" w:color="auto" w:fill="FFFFFF"/>
+        </w:rPr>
+        <w:t>Rs</w:t>
+      </w:r>
+      <w:proofErr w:type="spellEnd"/>
+      <w:r>
+        <w:rPr>
+          <w:rFonts w:ascii="Arial" w:hAnsi="Arial" w:cs="Arial"/>
+          <w:shd w:val="clear" w:color="auto" w:fill="FFFFFF"/>
+        </w:rPr>
+        <w:t xml:space="preserve">. 20 per kg with 30 kg of rice of other variety at </w:t>
+      </w:r>
+      <w:proofErr w:type="spellStart"/>
+      <w:r>
+        <w:rPr>
+          <w:rFonts w:ascii="Arial" w:hAnsi="Arial" w:cs="Arial"/>
+          <w:shd w:val="clear" w:color="auto" w:fill="FFFFFF"/>
+        </w:rPr>
+        <w:t>Rs</w:t>
+      </w:r>
+      <w:proofErr w:type="spellEnd"/>
+      <w:r>
+        <w:rPr>
+          <w:rFonts w:ascii="Arial" w:hAnsi="Arial" w:cs="Arial"/>
+          <w:shd w:val="clear" w:color="auto" w:fill="FFFFFF"/>
+        </w:rPr>
+        <w:t xml:space="preserve">. 36 per kg and sells the mixture at </w:t>
+      </w:r>
+      <w:proofErr w:type="spellStart"/>
+      <w:r>
+        <w:rPr>
+          <w:rFonts w:ascii="Arial" w:hAnsi="Arial" w:cs="Arial"/>
+          <w:shd w:val="clear" w:color="auto" w:fill="FFFFFF"/>
+        </w:rPr>
+        <w:t>Rs</w:t>
+      </w:r>
+      <w:proofErr w:type="spellEnd"/>
+      <w:r>
+        <w:rPr>
+          <w:rFonts w:ascii="Arial" w:hAnsi="Arial" w:cs="Arial"/>
+          <w:shd w:val="clear" w:color="auto" w:fill="FFFFFF"/>
+        </w:rPr>
+        <w:t>. 30 per kg. His profit percent is:</w:t>
       </w:r>
     </w:p>
     <w:sectPr>
@@ -1104,6 +1433,23 @@
       <w:contextualSpacing/>
     </w:pPr>
   </w:style>
+  <w:style w:type="character" w:styleId="Hyperlink">
+    <w:name w:val="Hyperlink"/>
+    <w:basedOn w:val="DefaultParagraphFont"/>
+    <w:uiPriority w:val="99"/>
+    <w:semiHidden/>
+    <w:unhideWhenUsed/>
+    <w:rsid w:val="0025470A"/>
+    <w:rPr>
+      <w:color w:val="0000FF"/>
+      <w:u w:val="single"/>
+    </w:rPr>
+  </w:style>
+  <w:style w:type="character" w:customStyle="1" w:styleId="google-anno-t">
+    <w:name w:val="google-anno-t"/>
+    <w:basedOn w:val="DefaultParagraphFont"/>
+    <w:rsid w:val="0025470A"/>
+  </w:style>
 </w:styles>
 </file>
 

</xml_diff>